<commit_message>
feat: enhance user experience with improved form handling and validation
</commit_message>
<xml_diff>
--- a/docs/Peer Group Assessment Form.docx
+++ b/docs/Peer Group Assessment Form.docx
@@ -1,6 +1,6 @@
 
 <file path=word/document.xml><?xml version="1.0" encoding="utf-8"?>
-<w:document xmlns:wpc="http://schemas.microsoft.com/office/word/2010/wordprocessingCanvas" xmlns:cx="http://schemas.microsoft.com/office/drawing/2014/chartex" xmlns:cx1="http://schemas.microsoft.com/office/drawing/2015/9/8/chartex" xmlns:cx2="http://schemas.microsoft.com/office/drawing/2015/10/21/chartex" xmlns:cx3="http://schemas.microsoft.com/office/drawing/2016/5/9/chartex" xmlns:cx4="http://schemas.microsoft.com/office/drawing/2016/5/10/chartex" xmlns:cx5="http://schemas.microsoft.com/office/drawing/2016/5/11/chartex" xmlns:cx6="http://schemas.microsoft.com/office/drawing/2016/5/12/chartex" xmlns:cx7="http://schemas.microsoft.com/office/drawing/2016/5/13/chartex" xmlns:cx8="http://schemas.microsoft.com/office/drawing/2016/5/14/chartex" xmlns:mc="http://schemas.openxmlformats.org/markup-compatibility/2006" xmlns:aink="http://schemas.microsoft.com/office/drawing/2016/ink" xmlns:am3d="http://schemas.microsoft.com/office/drawing/2017/model3d" xmlns:o="urn:schemas-microsoft-com:office:office" xmlns:oel="http://schemas.microsoft.com/office/2019/extlst" xmlns:r="http://schemas.openxmlformats.org/officeDocument/2006/relationships" xmlns:m="http://schemas.openxmlformats.org/officeDocument/2006/math" xmlns:v="urn:schemas-microsoft-com:vml" xmlns:wp14="http://schemas.microsoft.com/office/word/2010/wordprocessingDrawing" xmlns:wp="http://schemas.openxmlformats.org/drawingml/2006/wordprocessingDrawing" xmlns:w10="urn:schemas-microsoft-com:office:word" xmlns:w="http://schemas.openxmlformats.org/wordprocessingml/2006/main" xmlns:w14="http://schemas.microsoft.com/office/word/2010/wordml" xmlns:w15="http://schemas.microsoft.com/office/word/2012/wordml" xmlns:w16cex="http://schemas.microsoft.com/office/word/2018/wordml/cex" xmlns:w16cid="http://schemas.microsoft.com/office/word/2016/wordml/cid" xmlns:w16="http://schemas.microsoft.com/office/word/2018/wordml" xmlns:w16sdtdh="http://schemas.microsoft.com/office/word/2020/wordml/sdtdatahash" xmlns:w16se="http://schemas.microsoft.com/office/word/2015/wordml/symex" xmlns:wpg="http://schemas.microsoft.com/office/word/2010/wordprocessingGroup" xmlns:wpi="http://schemas.microsoft.com/office/word/2010/wordprocessingInk" xmlns:wne="http://schemas.microsoft.com/office/word/2006/wordml" xmlns:wps="http://schemas.microsoft.com/office/word/2010/wordprocessingShape" mc:Ignorable="w14 w15 w16se w16cid w16 w16cex w16sdtdh wp14">
+<w:document xmlns:wpc="http://schemas.microsoft.com/office/word/2010/wordprocessingCanvas" xmlns:cx="http://schemas.microsoft.com/office/drawing/2014/chartex" xmlns:cx1="http://schemas.microsoft.com/office/drawing/2015/9/8/chartex" xmlns:cx2="http://schemas.microsoft.com/office/drawing/2015/10/21/chartex" xmlns:cx3="http://schemas.microsoft.com/office/drawing/2016/5/9/chartex" xmlns:cx4="http://schemas.microsoft.com/office/drawing/2016/5/10/chartex" xmlns:cx5="http://schemas.microsoft.com/office/drawing/2016/5/11/chartex" xmlns:cx6="http://schemas.microsoft.com/office/drawing/2016/5/12/chartex" xmlns:cx7="http://schemas.microsoft.com/office/drawing/2016/5/13/chartex" xmlns:cx8="http://schemas.microsoft.com/office/drawing/2016/5/14/chartex" xmlns:mc="http://schemas.openxmlformats.org/markup-compatibility/2006" xmlns:aink="http://schemas.microsoft.com/office/drawing/2016/ink" xmlns:am3d="http://schemas.microsoft.com/office/drawing/2017/model3d" xmlns:o="urn:schemas-microsoft-com:office:office" xmlns:oel="http://schemas.microsoft.com/office/2019/extlst" xmlns:r="http://schemas.openxmlformats.org/officeDocument/2006/relationships" xmlns:m="http://schemas.openxmlformats.org/officeDocument/2006/math" xmlns:v="urn:schemas-microsoft-com:vml" xmlns:wp14="http://schemas.microsoft.com/office/word/2010/wordprocessingDrawing" xmlns:wp="http://schemas.openxmlformats.org/drawingml/2006/wordprocessingDrawing" xmlns:w10="urn:schemas-microsoft-com:office:word" xmlns:w="http://schemas.openxmlformats.org/wordprocessingml/2006/main" xmlns:w14="http://schemas.microsoft.com/office/word/2010/wordml" xmlns:w15="http://schemas.microsoft.com/office/word/2012/wordml" xmlns:w16cex="http://schemas.microsoft.com/office/word/2018/wordml/cex" xmlns:w16cid="http://schemas.microsoft.com/office/word/2016/wordml/cid" xmlns:w16="http://schemas.microsoft.com/office/word/2018/wordml" xmlns:w16du="http://schemas.microsoft.com/office/word/2023/wordml/word16du" xmlns:w16sdtdh="http://schemas.microsoft.com/office/word/2020/wordml/sdtdatahash" xmlns:w16sdtfl="http://schemas.microsoft.com/office/word/2024/wordml/sdtformatlock" xmlns:w16se="http://schemas.microsoft.com/office/word/2015/wordml/symex" xmlns:wpg="http://schemas.microsoft.com/office/word/2010/wordprocessingGroup" xmlns:wpi="http://schemas.microsoft.com/office/word/2010/wordprocessingInk" xmlns:wne="http://schemas.microsoft.com/office/word/2006/wordml" xmlns:wps="http://schemas.microsoft.com/office/word/2010/wordprocessingShape" mc:Ignorable="w14 w15 w16se w16cid w16 w16cex w16sdtdh w16sdtfl w16du wp14">
   <w:body>
     <w:p>
       <w:pPr>
@@ -19,7 +19,10 @@
     <w:p/>
     <w:p>
       <w:r>
-        <w:t>Your name ____________________________________________________</w:t>
+        <w:t>Your name</w:t>
+      </w:r>
+      <w:r>
+        <w:t>: Thomas Fitzpatrick</w:t>
       </w:r>
     </w:p>
     <w:p/>
@@ -147,7 +150,11 @@
           <w:tcPr>
             <w:tcW w:w="304" w:type="dxa"/>
           </w:tcPr>
-          <w:p/>
+          <w:p>
+            <w:r>
+              <w:t>N/A</w:t>
+            </w:r>
+          </w:p>
         </w:tc>
         <w:tc>
           <w:tcPr>
@@ -193,7 +200,11 @@
           <w:tcPr>
             <w:tcW w:w="304" w:type="dxa"/>
           </w:tcPr>
-          <w:p/>
+          <w:p>
+            <w:r>
+              <w:t>N/A</w:t>
+            </w:r>
+          </w:p>
         </w:tc>
         <w:tc>
           <w:tcPr>
@@ -239,7 +250,11 @@
           <w:tcPr>
             <w:tcW w:w="304" w:type="dxa"/>
           </w:tcPr>
-          <w:p/>
+          <w:p>
+            <w:r>
+              <w:t>N/A</w:t>
+            </w:r>
+          </w:p>
         </w:tc>
         <w:tc>
           <w:tcPr>
@@ -285,7 +300,11 @@
           <w:tcPr>
             <w:tcW w:w="304" w:type="dxa"/>
           </w:tcPr>
-          <w:p/>
+          <w:p>
+            <w:r>
+              <w:t>10</w:t>
+            </w:r>
+          </w:p>
         </w:tc>
         <w:tc>
           <w:tcPr>
@@ -331,7 +350,11 @@
           <w:tcPr>
             <w:tcW w:w="304" w:type="dxa"/>
           </w:tcPr>
-          <w:p/>
+          <w:p>
+            <w:r>
+              <w:t>N/A</w:t>
+            </w:r>
+          </w:p>
         </w:tc>
         <w:tc>
           <w:tcPr>
@@ -377,7 +400,11 @@
           <w:tcPr>
             <w:tcW w:w="304" w:type="dxa"/>
           </w:tcPr>
-          <w:p/>
+          <w:p>
+            <w:r>
+              <w:t>10</w:t>
+            </w:r>
+          </w:p>
         </w:tc>
         <w:tc>
           <w:tcPr>
@@ -423,7 +450,11 @@
           <w:tcPr>
             <w:tcW w:w="304" w:type="dxa"/>
           </w:tcPr>
-          <w:p/>
+          <w:p>
+            <w:r>
+              <w:t>10</w:t>
+            </w:r>
+          </w:p>
         </w:tc>
         <w:tc>
           <w:tcPr>
@@ -473,7 +504,12 @@
           <w:tcPr>
             <w:tcW w:w="304" w:type="dxa"/>
           </w:tcPr>
-          <w:p/>
+          <w:p>
+            <w:r>
+              <w:lastRenderedPageBreak/>
+              <w:t>10</w:t>
+            </w:r>
+          </w:p>
         </w:tc>
         <w:tc>
           <w:tcPr>
@@ -519,7 +555,11 @@
           <w:tcPr>
             <w:tcW w:w="304" w:type="dxa"/>
           </w:tcPr>
-          <w:p/>
+          <w:p>
+            <w:r>
+              <w:t>N/A</w:t>
+            </w:r>
+          </w:p>
         </w:tc>
         <w:tc>
           <w:tcPr>
@@ -565,7 +605,11 @@
           <w:tcPr>
             <w:tcW w:w="304" w:type="dxa"/>
           </w:tcPr>
-          <w:p/>
+          <w:p>
+            <w:r>
+              <w:t>N/A</w:t>
+            </w:r>
+          </w:p>
         </w:tc>
         <w:tc>
           <w:tcPr>
@@ -613,8 +657,11 @@
           <w:tcPr>
             <w:tcW w:w="304" w:type="dxa"/>
           </w:tcPr>
-          <w:p/>
-          <w:p/>
+          <w:p>
+            <w:r>
+              <w:t>40</w:t>
+            </w:r>
+          </w:p>
         </w:tc>
         <w:tc>
           <w:tcPr>
@@ -666,7 +713,11 @@
       </w:r>
     </w:p>
     <w:p/>
-    <w:p/>
+    <w:p>
+      <w:r>
+        <w:t>Effective</w:t>
+      </w:r>
+    </w:p>
     <w:p/>
     <w:p/>
     <w:p/>
@@ -688,7 +739,11 @@
     </w:p>
     <w:p/>
     <w:p/>
-    <w:p/>
+    <w:p>
+      <w:r>
+        <w:t>N/A</w:t>
+      </w:r>
+    </w:p>
     <w:p/>
     <w:p/>
     <w:p/>
@@ -708,7 +763,11 @@
         <w:t>What did you learn about working in a group from this project that you will carry into your next group experience?</w:t>
       </w:r>
     </w:p>
-    <w:p/>
+    <w:p>
+      <w:r>
+        <w:t>N/A</w:t>
+      </w:r>
+    </w:p>
     <w:sectPr>
       <w:footerReference w:type="default" r:id="rId7"/>
       <w:pgSz w:w="15840" w:h="12240" w:orient="landscape"/>
@@ -720,7 +779,7 @@
 </file>
 
 <file path=word/endnotes.xml><?xml version="1.0" encoding="utf-8"?>
-<w:endnotes xmlns:wpc="http://schemas.microsoft.com/office/word/2010/wordprocessingCanvas" xmlns:cx="http://schemas.microsoft.com/office/drawing/2014/chartex" xmlns:cx1="http://schemas.microsoft.com/office/drawing/2015/9/8/chartex" xmlns:cx2="http://schemas.microsoft.com/office/drawing/2015/10/21/chartex" xmlns:cx3="http://schemas.microsoft.com/office/drawing/2016/5/9/chartex" xmlns:cx4="http://schemas.microsoft.com/office/drawing/2016/5/10/chartex" xmlns:cx5="http://schemas.microsoft.com/office/drawing/2016/5/11/chartex" xmlns:cx6="http://schemas.microsoft.com/office/drawing/2016/5/12/chartex" xmlns:cx7="http://schemas.microsoft.com/office/drawing/2016/5/13/chartex" xmlns:cx8="http://schemas.microsoft.com/office/drawing/2016/5/14/chartex" xmlns:mc="http://schemas.openxmlformats.org/markup-compatibility/2006" xmlns:aink="http://schemas.microsoft.com/office/drawing/2016/ink" xmlns:am3d="http://schemas.microsoft.com/office/drawing/2017/model3d" xmlns:o="urn:schemas-microsoft-com:office:office" xmlns:oel="http://schemas.microsoft.com/office/2019/extlst" xmlns:r="http://schemas.openxmlformats.org/officeDocument/2006/relationships" xmlns:m="http://schemas.openxmlformats.org/officeDocument/2006/math" xmlns:v="urn:schemas-microsoft-com:vml" xmlns:wp14="http://schemas.microsoft.com/office/word/2010/wordprocessingDrawing" xmlns:wp="http://schemas.openxmlformats.org/drawingml/2006/wordprocessingDrawing" xmlns:w10="urn:schemas-microsoft-com:office:word" xmlns:w="http://schemas.openxmlformats.org/wordprocessingml/2006/main" xmlns:w14="http://schemas.microsoft.com/office/word/2010/wordml" xmlns:w15="http://schemas.microsoft.com/office/word/2012/wordml" xmlns:w16cex="http://schemas.microsoft.com/office/word/2018/wordml/cex" xmlns:w16cid="http://schemas.microsoft.com/office/word/2016/wordml/cid" xmlns:w16="http://schemas.microsoft.com/office/word/2018/wordml" xmlns:w16sdtdh="http://schemas.microsoft.com/office/word/2020/wordml/sdtdatahash" xmlns:w16se="http://schemas.microsoft.com/office/word/2015/wordml/symex" xmlns:wpg="http://schemas.microsoft.com/office/word/2010/wordprocessingGroup" xmlns:wpi="http://schemas.microsoft.com/office/word/2010/wordprocessingInk" xmlns:wne="http://schemas.microsoft.com/office/word/2006/wordml" xmlns:wps="http://schemas.microsoft.com/office/word/2010/wordprocessingShape" mc:Ignorable="w14 w15 w16se w16cid w16 w16cex w16sdtdh wp14">
+<w:endnotes xmlns:wpc="http://schemas.microsoft.com/office/word/2010/wordprocessingCanvas" xmlns:cx="http://schemas.microsoft.com/office/drawing/2014/chartex" xmlns:cx1="http://schemas.microsoft.com/office/drawing/2015/9/8/chartex" xmlns:cx2="http://schemas.microsoft.com/office/drawing/2015/10/21/chartex" xmlns:cx3="http://schemas.microsoft.com/office/drawing/2016/5/9/chartex" xmlns:cx4="http://schemas.microsoft.com/office/drawing/2016/5/10/chartex" xmlns:cx5="http://schemas.microsoft.com/office/drawing/2016/5/11/chartex" xmlns:cx6="http://schemas.microsoft.com/office/drawing/2016/5/12/chartex" xmlns:cx7="http://schemas.microsoft.com/office/drawing/2016/5/13/chartex" xmlns:cx8="http://schemas.microsoft.com/office/drawing/2016/5/14/chartex" xmlns:mc="http://schemas.openxmlformats.org/markup-compatibility/2006" xmlns:aink="http://schemas.microsoft.com/office/drawing/2016/ink" xmlns:am3d="http://schemas.microsoft.com/office/drawing/2017/model3d" xmlns:o="urn:schemas-microsoft-com:office:office" xmlns:oel="http://schemas.microsoft.com/office/2019/extlst" xmlns:r="http://schemas.openxmlformats.org/officeDocument/2006/relationships" xmlns:m="http://schemas.openxmlformats.org/officeDocument/2006/math" xmlns:v="urn:schemas-microsoft-com:vml" xmlns:wp14="http://schemas.microsoft.com/office/word/2010/wordprocessingDrawing" xmlns:wp="http://schemas.openxmlformats.org/drawingml/2006/wordprocessingDrawing" xmlns:w10="urn:schemas-microsoft-com:office:word" xmlns:w="http://schemas.openxmlformats.org/wordprocessingml/2006/main" xmlns:w14="http://schemas.microsoft.com/office/word/2010/wordml" xmlns:w15="http://schemas.microsoft.com/office/word/2012/wordml" xmlns:w16cex="http://schemas.microsoft.com/office/word/2018/wordml/cex" xmlns:w16cid="http://schemas.microsoft.com/office/word/2016/wordml/cid" xmlns:w16="http://schemas.microsoft.com/office/word/2018/wordml" xmlns:w16du="http://schemas.microsoft.com/office/word/2023/wordml/word16du" xmlns:w16sdtdh="http://schemas.microsoft.com/office/word/2020/wordml/sdtdatahash" xmlns:w16sdtfl="http://schemas.microsoft.com/office/word/2024/wordml/sdtformatlock" xmlns:w16se="http://schemas.microsoft.com/office/word/2015/wordml/symex" xmlns:wpg="http://schemas.microsoft.com/office/word/2010/wordprocessingGroup" xmlns:wpi="http://schemas.microsoft.com/office/word/2010/wordprocessingInk" xmlns:wne="http://schemas.microsoft.com/office/word/2006/wordml" xmlns:wps="http://schemas.microsoft.com/office/word/2010/wordprocessingShape" mc:Ignorable="w14 w15 w16se w16cid w16 w16cex w16sdtdh w16sdtfl w16du wp14">
   <w:endnote w:type="separator" w:id="-1">
     <w:p>
       <w:r>
@@ -739,7 +798,7 @@
 </file>
 
 <file path=word/footer1.xml><?xml version="1.0" encoding="utf-8"?>
-<w:ftr xmlns:wpc="http://schemas.microsoft.com/office/word/2010/wordprocessingCanvas" xmlns:cx="http://schemas.microsoft.com/office/drawing/2014/chartex" xmlns:cx1="http://schemas.microsoft.com/office/drawing/2015/9/8/chartex" xmlns:cx2="http://schemas.microsoft.com/office/drawing/2015/10/21/chartex" xmlns:cx3="http://schemas.microsoft.com/office/drawing/2016/5/9/chartex" xmlns:cx4="http://schemas.microsoft.com/office/drawing/2016/5/10/chartex" xmlns:cx5="http://schemas.microsoft.com/office/drawing/2016/5/11/chartex" xmlns:cx6="http://schemas.microsoft.com/office/drawing/2016/5/12/chartex" xmlns:cx7="http://schemas.microsoft.com/office/drawing/2016/5/13/chartex" xmlns:cx8="http://schemas.microsoft.com/office/drawing/2016/5/14/chartex" xmlns:mc="http://schemas.openxmlformats.org/markup-compatibility/2006" xmlns:aink="http://schemas.microsoft.com/office/drawing/2016/ink" xmlns:am3d="http://schemas.microsoft.com/office/drawing/2017/model3d" xmlns:o="urn:schemas-microsoft-com:office:office" xmlns:oel="http://schemas.microsoft.com/office/2019/extlst" xmlns:r="http://schemas.openxmlformats.org/officeDocument/2006/relationships" xmlns:m="http://schemas.openxmlformats.org/officeDocument/2006/math" xmlns:v="urn:schemas-microsoft-com:vml" xmlns:wp14="http://schemas.microsoft.com/office/word/2010/wordprocessingDrawing" xmlns:wp="http://schemas.openxmlformats.org/drawingml/2006/wordprocessingDrawing" xmlns:w10="urn:schemas-microsoft-com:office:word" xmlns:w="http://schemas.openxmlformats.org/wordprocessingml/2006/main" xmlns:w14="http://schemas.microsoft.com/office/word/2010/wordml" xmlns:w15="http://schemas.microsoft.com/office/word/2012/wordml" xmlns:w16cex="http://schemas.microsoft.com/office/word/2018/wordml/cex" xmlns:w16cid="http://schemas.microsoft.com/office/word/2016/wordml/cid" xmlns:w16="http://schemas.microsoft.com/office/word/2018/wordml" xmlns:w16sdtdh="http://schemas.microsoft.com/office/word/2020/wordml/sdtdatahash" xmlns:w16se="http://schemas.microsoft.com/office/word/2015/wordml/symex" xmlns:wpg="http://schemas.microsoft.com/office/word/2010/wordprocessingGroup" xmlns:wpi="http://schemas.microsoft.com/office/word/2010/wordprocessingInk" xmlns:wne="http://schemas.microsoft.com/office/word/2006/wordml" xmlns:wps="http://schemas.microsoft.com/office/word/2010/wordprocessingShape" mc:Ignorable="w14 w15 w16se w16cid w16 w16cex w16sdtdh wp14">
+<w:ftr xmlns:wpc="http://schemas.microsoft.com/office/word/2010/wordprocessingCanvas" xmlns:cx="http://schemas.microsoft.com/office/drawing/2014/chartex" xmlns:cx1="http://schemas.microsoft.com/office/drawing/2015/9/8/chartex" xmlns:cx2="http://schemas.microsoft.com/office/drawing/2015/10/21/chartex" xmlns:cx3="http://schemas.microsoft.com/office/drawing/2016/5/9/chartex" xmlns:cx4="http://schemas.microsoft.com/office/drawing/2016/5/10/chartex" xmlns:cx5="http://schemas.microsoft.com/office/drawing/2016/5/11/chartex" xmlns:cx6="http://schemas.microsoft.com/office/drawing/2016/5/12/chartex" xmlns:cx7="http://schemas.microsoft.com/office/drawing/2016/5/13/chartex" xmlns:cx8="http://schemas.microsoft.com/office/drawing/2016/5/14/chartex" xmlns:mc="http://schemas.openxmlformats.org/markup-compatibility/2006" xmlns:aink="http://schemas.microsoft.com/office/drawing/2016/ink" xmlns:am3d="http://schemas.microsoft.com/office/drawing/2017/model3d" xmlns:o="urn:schemas-microsoft-com:office:office" xmlns:oel="http://schemas.microsoft.com/office/2019/extlst" xmlns:r="http://schemas.openxmlformats.org/officeDocument/2006/relationships" xmlns:m="http://schemas.openxmlformats.org/officeDocument/2006/math" xmlns:v="urn:schemas-microsoft-com:vml" xmlns:wp14="http://schemas.microsoft.com/office/word/2010/wordprocessingDrawing" xmlns:wp="http://schemas.openxmlformats.org/drawingml/2006/wordprocessingDrawing" xmlns:w10="urn:schemas-microsoft-com:office:word" xmlns:w="http://schemas.openxmlformats.org/wordprocessingml/2006/main" xmlns:w14="http://schemas.microsoft.com/office/word/2010/wordml" xmlns:w15="http://schemas.microsoft.com/office/word/2012/wordml" xmlns:w16cex="http://schemas.microsoft.com/office/word/2018/wordml/cex" xmlns:w16cid="http://schemas.microsoft.com/office/word/2016/wordml/cid" xmlns:w16="http://schemas.microsoft.com/office/word/2018/wordml" xmlns:w16du="http://schemas.microsoft.com/office/word/2023/wordml/word16du" xmlns:w16sdtdh="http://schemas.microsoft.com/office/word/2020/wordml/sdtdatahash" xmlns:w16sdtfl="http://schemas.microsoft.com/office/word/2024/wordml/sdtformatlock" xmlns:w16se="http://schemas.microsoft.com/office/word/2015/wordml/symex" xmlns:wpg="http://schemas.microsoft.com/office/word/2010/wordprocessingGroup" xmlns:wpi="http://schemas.microsoft.com/office/word/2010/wordprocessingInk" xmlns:wne="http://schemas.microsoft.com/office/word/2006/wordml" xmlns:wps="http://schemas.microsoft.com/office/word/2010/wordprocessingShape" mc:Ignorable="w14 w15 w16se w16cid w16 w16cex w16sdtdh w16sdtfl w16du wp14">
   <w:p>
     <w:pPr>
       <w:rPr>
@@ -750,21 +809,7 @@
       <w:rPr>
         <w:sz w:val="20"/>
       </w:rPr>
-      <w:t>Adapted from a peer evaluation form developed at Johns Hopkins University (</w:t>
-    </w:r>
-    <w:proofErr w:type="gramStart"/>
-    <w:r>
-      <w:rPr>
-        <w:sz w:val="20"/>
-      </w:rPr>
-      <w:t>October,</w:t>
-    </w:r>
-    <w:proofErr w:type="gramEnd"/>
-    <w:r>
-      <w:rPr>
-        <w:sz w:val="20"/>
-      </w:rPr>
-      <w:t xml:space="preserve"> 2006)</w:t>
+      <w:t>Adapted from a peer evaluation form developed at Johns Hopkins University (October, 2006)</w:t>
     </w:r>
   </w:p>
   <w:p>
@@ -776,7 +821,7 @@
 </file>
 
 <file path=word/footnotes.xml><?xml version="1.0" encoding="utf-8"?>
-<w:footnotes xmlns:wpc="http://schemas.microsoft.com/office/word/2010/wordprocessingCanvas" xmlns:cx="http://schemas.microsoft.com/office/drawing/2014/chartex" xmlns:cx1="http://schemas.microsoft.com/office/drawing/2015/9/8/chartex" xmlns:cx2="http://schemas.microsoft.com/office/drawing/2015/10/21/chartex" xmlns:cx3="http://schemas.microsoft.com/office/drawing/2016/5/9/chartex" xmlns:cx4="http://schemas.microsoft.com/office/drawing/2016/5/10/chartex" xmlns:cx5="http://schemas.microsoft.com/office/drawing/2016/5/11/chartex" xmlns:cx6="http://schemas.microsoft.com/office/drawing/2016/5/12/chartex" xmlns:cx7="http://schemas.microsoft.com/office/drawing/2016/5/13/chartex" xmlns:cx8="http://schemas.microsoft.com/office/drawing/2016/5/14/chartex" xmlns:mc="http://schemas.openxmlformats.org/markup-compatibility/2006" xmlns:aink="http://schemas.microsoft.com/office/drawing/2016/ink" xmlns:am3d="http://schemas.microsoft.com/office/drawing/2017/model3d" xmlns:o="urn:schemas-microsoft-com:office:office" xmlns:oel="http://schemas.microsoft.com/office/2019/extlst" xmlns:r="http://schemas.openxmlformats.org/officeDocument/2006/relationships" xmlns:m="http://schemas.openxmlformats.org/officeDocument/2006/math" xmlns:v="urn:schemas-microsoft-com:vml" xmlns:wp14="http://schemas.microsoft.com/office/word/2010/wordprocessingDrawing" xmlns:wp="http://schemas.openxmlformats.org/drawingml/2006/wordprocessingDrawing" xmlns:w10="urn:schemas-microsoft-com:office:word" xmlns:w="http://schemas.openxmlformats.org/wordprocessingml/2006/main" xmlns:w14="http://schemas.microsoft.com/office/word/2010/wordml" xmlns:w15="http://schemas.microsoft.com/office/word/2012/wordml" xmlns:w16cex="http://schemas.microsoft.com/office/word/2018/wordml/cex" xmlns:w16cid="http://schemas.microsoft.com/office/word/2016/wordml/cid" xmlns:w16="http://schemas.microsoft.com/office/word/2018/wordml" xmlns:w16sdtdh="http://schemas.microsoft.com/office/word/2020/wordml/sdtdatahash" xmlns:w16se="http://schemas.microsoft.com/office/word/2015/wordml/symex" xmlns:wpg="http://schemas.microsoft.com/office/word/2010/wordprocessingGroup" xmlns:wpi="http://schemas.microsoft.com/office/word/2010/wordprocessingInk" xmlns:wne="http://schemas.microsoft.com/office/word/2006/wordml" xmlns:wps="http://schemas.microsoft.com/office/word/2010/wordprocessingShape" mc:Ignorable="w14 w15 w16se w16cid w16 w16cex w16sdtdh wp14">
+<w:footnotes xmlns:wpc="http://schemas.microsoft.com/office/word/2010/wordprocessingCanvas" xmlns:cx="http://schemas.microsoft.com/office/drawing/2014/chartex" xmlns:cx1="http://schemas.microsoft.com/office/drawing/2015/9/8/chartex" xmlns:cx2="http://schemas.microsoft.com/office/drawing/2015/10/21/chartex" xmlns:cx3="http://schemas.microsoft.com/office/drawing/2016/5/9/chartex" xmlns:cx4="http://schemas.microsoft.com/office/drawing/2016/5/10/chartex" xmlns:cx5="http://schemas.microsoft.com/office/drawing/2016/5/11/chartex" xmlns:cx6="http://schemas.microsoft.com/office/drawing/2016/5/12/chartex" xmlns:cx7="http://schemas.microsoft.com/office/drawing/2016/5/13/chartex" xmlns:cx8="http://schemas.microsoft.com/office/drawing/2016/5/14/chartex" xmlns:mc="http://schemas.openxmlformats.org/markup-compatibility/2006" xmlns:aink="http://schemas.microsoft.com/office/drawing/2016/ink" xmlns:am3d="http://schemas.microsoft.com/office/drawing/2017/model3d" xmlns:o="urn:schemas-microsoft-com:office:office" xmlns:oel="http://schemas.microsoft.com/office/2019/extlst" xmlns:r="http://schemas.openxmlformats.org/officeDocument/2006/relationships" xmlns:m="http://schemas.openxmlformats.org/officeDocument/2006/math" xmlns:v="urn:schemas-microsoft-com:vml" xmlns:wp14="http://schemas.microsoft.com/office/word/2010/wordprocessingDrawing" xmlns:wp="http://schemas.openxmlformats.org/drawingml/2006/wordprocessingDrawing" xmlns:w10="urn:schemas-microsoft-com:office:word" xmlns:w="http://schemas.openxmlformats.org/wordprocessingml/2006/main" xmlns:w14="http://schemas.microsoft.com/office/word/2010/wordml" xmlns:w15="http://schemas.microsoft.com/office/word/2012/wordml" xmlns:w16cex="http://schemas.microsoft.com/office/word/2018/wordml/cex" xmlns:w16cid="http://schemas.microsoft.com/office/word/2016/wordml/cid" xmlns:w16="http://schemas.microsoft.com/office/word/2018/wordml" xmlns:w16du="http://schemas.microsoft.com/office/word/2023/wordml/word16du" xmlns:w16sdtdh="http://schemas.microsoft.com/office/word/2020/wordml/sdtdatahash" xmlns:w16sdtfl="http://schemas.microsoft.com/office/word/2024/wordml/sdtformatlock" xmlns:w16se="http://schemas.microsoft.com/office/word/2015/wordml/symex" xmlns:wpg="http://schemas.microsoft.com/office/word/2010/wordprocessingGroup" xmlns:wpi="http://schemas.microsoft.com/office/word/2010/wordprocessingInk" xmlns:wne="http://schemas.microsoft.com/office/word/2006/wordml" xmlns:wps="http://schemas.microsoft.com/office/word/2010/wordprocessingShape" mc:Ignorable="w14 w15 w16se w16cid w16 w16cex w16sdtdh w16sdtfl w16du wp14">
   <w:footnote w:type="separator" w:id="-1">
     <w:p>
       <w:r>
@@ -795,7 +840,7 @@
 </file>
 
 <file path=word/numbering.xml><?xml version="1.0" encoding="utf-8"?>
-<w:numbering xmlns:wpc="http://schemas.microsoft.com/office/word/2010/wordprocessingCanvas" xmlns:cx="http://schemas.microsoft.com/office/drawing/2014/chartex" xmlns:cx1="http://schemas.microsoft.com/office/drawing/2015/9/8/chartex" xmlns:cx2="http://schemas.microsoft.com/office/drawing/2015/10/21/chartex" xmlns:cx3="http://schemas.microsoft.com/office/drawing/2016/5/9/chartex" xmlns:cx4="http://schemas.microsoft.com/office/drawing/2016/5/10/chartex" xmlns:cx5="http://schemas.microsoft.com/office/drawing/2016/5/11/chartex" xmlns:cx6="http://schemas.microsoft.com/office/drawing/2016/5/12/chartex" xmlns:cx7="http://schemas.microsoft.com/office/drawing/2016/5/13/chartex" xmlns:cx8="http://schemas.microsoft.com/office/drawing/2016/5/14/chartex" xmlns:mc="http://schemas.openxmlformats.org/markup-compatibility/2006" xmlns:aink="http://schemas.microsoft.com/office/drawing/2016/ink" xmlns:am3d="http://schemas.microsoft.com/office/drawing/2017/model3d" xmlns:o="urn:schemas-microsoft-com:office:office" xmlns:oel="http://schemas.microsoft.com/office/2019/extlst" xmlns:r="http://schemas.openxmlformats.org/officeDocument/2006/relationships" xmlns:m="http://schemas.openxmlformats.org/officeDocument/2006/math" xmlns:v="urn:schemas-microsoft-com:vml" xmlns:wp14="http://schemas.microsoft.com/office/word/2010/wordprocessingDrawing" xmlns:wp="http://schemas.openxmlformats.org/drawingml/2006/wordprocessingDrawing" xmlns:w10="urn:schemas-microsoft-com:office:word" xmlns:w="http://schemas.openxmlformats.org/wordprocessingml/2006/main" xmlns:w14="http://schemas.microsoft.com/office/word/2010/wordml" xmlns:w15="http://schemas.microsoft.com/office/word/2012/wordml" xmlns:w16cex="http://schemas.microsoft.com/office/word/2018/wordml/cex" xmlns:w16cid="http://schemas.microsoft.com/office/word/2016/wordml/cid" xmlns:w16="http://schemas.microsoft.com/office/word/2018/wordml" xmlns:w16sdtdh="http://schemas.microsoft.com/office/word/2020/wordml/sdtdatahash" xmlns:w16se="http://schemas.microsoft.com/office/word/2015/wordml/symex" xmlns:wpg="http://schemas.microsoft.com/office/word/2010/wordprocessingGroup" xmlns:wpi="http://schemas.microsoft.com/office/word/2010/wordprocessingInk" xmlns:wne="http://schemas.microsoft.com/office/word/2006/wordml" xmlns:wps="http://schemas.microsoft.com/office/word/2010/wordprocessingShape" mc:Ignorable="w14 w15 w16se w16cid w16 w16cex w16sdtdh wp14">
+<w:numbering xmlns:wpc="http://schemas.microsoft.com/office/word/2010/wordprocessingCanvas" xmlns:cx="http://schemas.microsoft.com/office/drawing/2014/chartex" xmlns:cx1="http://schemas.microsoft.com/office/drawing/2015/9/8/chartex" xmlns:cx2="http://schemas.microsoft.com/office/drawing/2015/10/21/chartex" xmlns:cx3="http://schemas.microsoft.com/office/drawing/2016/5/9/chartex" xmlns:cx4="http://schemas.microsoft.com/office/drawing/2016/5/10/chartex" xmlns:cx5="http://schemas.microsoft.com/office/drawing/2016/5/11/chartex" xmlns:cx6="http://schemas.microsoft.com/office/drawing/2016/5/12/chartex" xmlns:cx7="http://schemas.microsoft.com/office/drawing/2016/5/13/chartex" xmlns:cx8="http://schemas.microsoft.com/office/drawing/2016/5/14/chartex" xmlns:mc="http://schemas.openxmlformats.org/markup-compatibility/2006" xmlns:aink="http://schemas.microsoft.com/office/drawing/2016/ink" xmlns:am3d="http://schemas.microsoft.com/office/drawing/2017/model3d" xmlns:o="urn:schemas-microsoft-com:office:office" xmlns:oel="http://schemas.microsoft.com/office/2019/extlst" xmlns:r="http://schemas.openxmlformats.org/officeDocument/2006/relationships" xmlns:m="http://schemas.openxmlformats.org/officeDocument/2006/math" xmlns:v="urn:schemas-microsoft-com:vml" xmlns:wp14="http://schemas.microsoft.com/office/word/2010/wordprocessingDrawing" xmlns:wp="http://schemas.openxmlformats.org/drawingml/2006/wordprocessingDrawing" xmlns:w10="urn:schemas-microsoft-com:office:word" xmlns:w="http://schemas.openxmlformats.org/wordprocessingml/2006/main" xmlns:w14="http://schemas.microsoft.com/office/word/2010/wordml" xmlns:w15="http://schemas.microsoft.com/office/word/2012/wordml" xmlns:w16cex="http://schemas.microsoft.com/office/word/2018/wordml/cex" xmlns:w16cid="http://schemas.microsoft.com/office/word/2016/wordml/cid" xmlns:w16="http://schemas.microsoft.com/office/word/2018/wordml" xmlns:w16du="http://schemas.microsoft.com/office/word/2023/wordml/word16du" xmlns:w16sdtdh="http://schemas.microsoft.com/office/word/2020/wordml/sdtdatahash" xmlns:w16sdtfl="http://schemas.microsoft.com/office/word/2024/wordml/sdtformatlock" xmlns:w16se="http://schemas.microsoft.com/office/word/2015/wordml/symex" xmlns:wpg="http://schemas.microsoft.com/office/word/2010/wordprocessingGroup" xmlns:wpi="http://schemas.microsoft.com/office/word/2010/wordprocessingInk" xmlns:wne="http://schemas.microsoft.com/office/word/2006/wordml" xmlns:wps="http://schemas.microsoft.com/office/word/2010/wordprocessingShape" mc:Ignorable="w14 w15 w16se w16cid w16 w16cex w16sdtdh w16sdtfl w16du wp14">
   <w:abstractNum w:abstractNumId="0" w15:restartNumberingAfterBreak="0">
     <w:nsid w:val="461C670D"/>
     <w:multiLevelType w:val="hybridMultilevel"/>
@@ -892,7 +937,7 @@
 </file>
 
 <file path=word/styles.xml><?xml version="1.0" encoding="utf-8"?>
-<w:styles xmlns:mc="http://schemas.openxmlformats.org/markup-compatibility/2006" xmlns:r="http://schemas.openxmlformats.org/officeDocument/2006/relationships" xmlns:w="http://schemas.openxmlformats.org/wordprocessingml/2006/main" xmlns:w14="http://schemas.microsoft.com/office/word/2010/wordml" xmlns:w15="http://schemas.microsoft.com/office/word/2012/wordml" xmlns:w16cex="http://schemas.microsoft.com/office/word/2018/wordml/cex" xmlns:w16cid="http://schemas.microsoft.com/office/word/2016/wordml/cid" xmlns:w16="http://schemas.microsoft.com/office/word/2018/wordml" xmlns:w16sdtdh="http://schemas.microsoft.com/office/word/2020/wordml/sdtdatahash" xmlns:w16se="http://schemas.microsoft.com/office/word/2015/wordml/symex" mc:Ignorable="w14 w15 w16se w16cid w16 w16cex w16sdtdh">
+<w:styles xmlns:mc="http://schemas.openxmlformats.org/markup-compatibility/2006" xmlns:r="http://schemas.openxmlformats.org/officeDocument/2006/relationships" xmlns:w="http://schemas.openxmlformats.org/wordprocessingml/2006/main" xmlns:w14="http://schemas.microsoft.com/office/word/2010/wordml" xmlns:w15="http://schemas.microsoft.com/office/word/2012/wordml" xmlns:w16cex="http://schemas.microsoft.com/office/word/2018/wordml/cex" xmlns:w16cid="http://schemas.microsoft.com/office/word/2016/wordml/cid" xmlns:w16="http://schemas.microsoft.com/office/word/2018/wordml" xmlns:w16du="http://schemas.microsoft.com/office/word/2023/wordml/word16du" xmlns:w16sdtdh="http://schemas.microsoft.com/office/word/2020/wordml/sdtdatahash" xmlns:w16sdtfl="http://schemas.microsoft.com/office/word/2024/wordml/sdtformatlock" xmlns:w16se="http://schemas.microsoft.com/office/word/2015/wordml/symex" mc:Ignorable="w14 w15 w16se w16cid w16 w16cex w16sdtdh w16sdtfl w16du">
   <w:docDefaults>
     <w:rPrDefault>
       <w:rPr>

</xml_diff>